<commit_message>
update project files, submission
</commit_message>
<xml_diff>
--- a/report/asfaw_paudel_hair_follicle_modeling.docx
+++ b/report/asfaw_paudel_hair_follicle_modeling.docx
@@ -49,16 +49,7 @@
           <w:sz w:val="24"/>
           <w:szCs w:val="24"/>
         </w:rPr>
-        <w:t>Dynamics of the Hair Follicle: An SIR-Based Analysis of Biochemical Activation and Hormonal Inhibition</w:t>
-      </w:r>
-      <w:r>
-        <w:rPr>
-          <w:rFonts w:ascii="Times New Roman" w:eastAsiaTheme="minorHAnsi" w:hAnsi="Times New Roman" w:cs="Times New Roman"/>
-          <w:color w:val="auto"/>
-          <w:sz w:val="24"/>
-          <w:szCs w:val="24"/>
-        </w:rPr>
-        <w:t>.</w:t>
+        <w:t>Multi-Subject Analysis of Hair Cycle Dynamics: A Sub-compartmentalized SIR-Based ODE Modeling.</w:t>
       </w:r>
     </w:p>
     <w:p>
@@ -1646,307 +1637,22 @@
         <w:rPr>
           <w:rFonts w:eastAsiaTheme="minorHAnsi"/>
         </w:rPr>
-        <w:t xml:space="preserve">The axial profile </w:t>
-      </w:r>
-      <w:r>
-        <w:rPr>
-          <w:rFonts w:eastAsiaTheme="minorHAnsi"/>
-        </w:rPr>
-        <w:t xml:space="preserve">of the concentration difference </w:t>
-      </w:r>
-      <m:oMath>
-        <m:r>
-          <w:rPr>
-            <w:rFonts w:ascii="Cambria Math" w:hAnsi="Cambria Math"/>
-          </w:rPr>
-          <m:t>∆</m:t>
-        </m:r>
-        <m:d>
-          <m:dPr>
-            <m:ctrlPr>
-              <w:rPr>
-                <w:rFonts w:ascii="Cambria Math" w:hAnsi="Cambria Math"/>
-                <w:i/>
-              </w:rPr>
-            </m:ctrlPr>
-          </m:dPr>
-          <m:e>
-            <m:r>
-              <w:rPr>
-                <w:rFonts w:ascii="Cambria Math" w:hAnsi="Cambria Math"/>
-              </w:rPr>
-              <m:t>x</m:t>
-            </m:r>
-          </m:e>
-        </m:d>
-      </m:oMath>
-      <w:r>
-        <w:rPr>
-          <w:rFonts w:eastAsiaTheme="minorEastAsia"/>
-        </w:rPr>
-        <w:t xml:space="preserve"> between blood and dialysate for co-current (CO) and counter-current</w:t>
-      </w:r>
-      <w:r>
-        <w:rPr>
-          <w:rFonts w:eastAsiaTheme="minorEastAsia"/>
-        </w:rPr>
-        <w:t xml:space="preserve"> (CC) flow is shown for the lumped two-compartment box model of the dialyzer (</w:t>
-      </w:r>
-      <w:r>
-        <w:rPr>
-          <w:rFonts w:eastAsiaTheme="minorEastAsia"/>
-          <w:b/>
-          <w:bCs/>
-          <w:i/>
-          <w:iCs/>
-        </w:rPr>
-        <w:t xml:space="preserve">Figure </w:t>
-      </w:r>
-      <w:r>
-        <w:rPr>
-          <w:rFonts w:eastAsiaTheme="minorEastAsia"/>
-          <w:b/>
-          <w:bCs/>
-          <w:i/>
-          <w:iCs/>
-        </w:rPr>
-        <w:t>2</w:t>
-      </w:r>
-      <w:r>
-        <w:rPr>
-          <w:rFonts w:eastAsiaTheme="minorEastAsia"/>
-          <w:b/>
-          <w:bCs/>
-          <w:i/>
-          <w:iCs/>
-        </w:rPr>
-        <w:t>a</w:t>
-      </w:r>
-      <w:r>
-        <w:rPr>
-          <w:rFonts w:eastAsiaTheme="minorEastAsia"/>
-        </w:rPr>
-        <w:t>). In the CO configuration, the two streams enter</w:t>
-      </w:r>
-      <w:r>
-        <w:rPr>
-          <w:rFonts w:eastAsiaTheme="minorEastAsia"/>
-        </w:rPr>
-        <w:t xml:space="preserve"> with the largest initial concentration </w:t>
-      </w:r>
-      <w:r>
-        <w:rPr>
-          <w:rFonts w:eastAsiaTheme="minorEastAsia"/>
-        </w:rPr>
-        <w:t xml:space="preserve">difference </w:t>
-      </w:r>
-      <m:oMath>
-        <m:r>
-          <w:rPr>
-            <w:rFonts w:ascii="Cambria Math" w:hAnsi="Cambria Math"/>
-          </w:rPr>
-          <m:t>∆</m:t>
-        </m:r>
-        <m:d>
-          <m:dPr>
-            <m:ctrlPr>
-              <w:rPr>
-                <w:rFonts w:ascii="Cambria Math" w:hAnsi="Cambria Math"/>
-                <w:i/>
-              </w:rPr>
-            </m:ctrlPr>
-          </m:dPr>
-          <m:e>
-            <m:r>
-              <w:rPr>
-                <w:rFonts w:ascii="Cambria Math" w:hAnsi="Cambria Math"/>
-              </w:rPr>
-              <m:t>0</m:t>
-            </m:r>
-          </m:e>
-        </m:d>
-      </m:oMath>
-      <w:r>
-        <w:rPr>
-          <w:rFonts w:eastAsiaTheme="minorEastAsia"/>
-        </w:rPr>
-        <w:t xml:space="preserve">, </w:t>
-      </w:r>
-      <w:r>
-        <w:rPr>
-          <w:rFonts w:eastAsiaTheme="minorEastAsia"/>
-        </w:rPr>
-        <w:t xml:space="preserve">but this driving force collapses rapidly as both fluids move </w:t>
-      </w:r>
-      <w:r>
-        <w:rPr>
-          <w:rFonts w:eastAsiaTheme="minorEastAsia"/>
-        </w:rPr>
-        <w:t>in the same direction</w:t>
-      </w:r>
-      <w:r>
-        <w:rPr>
-          <w:rFonts w:eastAsiaTheme="minorEastAsia"/>
-        </w:rPr>
-        <w:t xml:space="preserve"> and </w:t>
-      </w:r>
-      <w:r>
-        <w:rPr>
-          <w:rFonts w:eastAsiaTheme="minorEastAsia"/>
-        </w:rPr>
-        <w:t xml:space="preserve">quickly approach local equilibrium. </w:t>
-      </w:r>
-      <w:r>
-        <w:rPr>
-          <w:rFonts w:eastAsiaTheme="minorEastAsia"/>
-        </w:rPr>
-        <w:t>As a consequence</w:t>
-      </w:r>
-      <w:r>
-        <w:rPr>
-          <w:rFonts w:eastAsiaTheme="minorEastAsia"/>
-        </w:rPr>
-        <w:t xml:space="preserve">, most solute removal occurs near the inlet, and the remaining </w:t>
-      </w:r>
-      <w:r>
-        <w:rPr>
-          <w:rFonts w:eastAsiaTheme="minorEastAsia"/>
-        </w:rPr>
-        <w:t>fiber</w:t>
-      </w:r>
-      <w:r>
-        <w:rPr>
-          <w:rFonts w:eastAsiaTheme="minorEastAsia"/>
-        </w:rPr>
-        <w:t xml:space="preserve"> length contributes little additional clearance. In contrast, the CC configuration main</w:t>
-      </w:r>
-      <w:r>
-        <w:rPr>
-          <w:rFonts w:eastAsiaTheme="minorEastAsia"/>
-        </w:rPr>
-        <w:t xml:space="preserve">tains a more </w:t>
-      </w:r>
-      <w:r>
-        <w:rPr>
-          <w:rFonts w:eastAsiaTheme="minorEastAsia"/>
-        </w:rPr>
-        <w:t>uniform</w:t>
-      </w:r>
-      <w:r>
-        <w:rPr>
-          <w:rFonts w:eastAsiaTheme="minorEastAsia"/>
-        </w:rPr>
-        <w:t xml:space="preserve"> and sustained </w:t>
-      </w:r>
-      <w:r>
-        <w:rPr>
-          <w:rFonts w:eastAsiaTheme="minorEastAsia"/>
-        </w:rPr>
-        <w:t>concentration</w:t>
-      </w:r>
-      <w:r>
-        <w:rPr>
-          <w:rFonts w:eastAsiaTheme="minorEastAsia"/>
-        </w:rPr>
-        <w:t xml:space="preserve"> difference along the entire </w:t>
-      </w:r>
-      <w:r>
-        <w:rPr>
-          <w:rFonts w:eastAsiaTheme="minorEastAsia"/>
-        </w:rPr>
-        <w:t>length</w:t>
-      </w:r>
-      <w:r>
-        <w:rPr>
-          <w:rFonts w:eastAsiaTheme="minorEastAsia"/>
-        </w:rPr>
-        <w:t xml:space="preserve">. </w:t>
-      </w:r>
-      <w:r>
-        <w:rPr>
-          <w:rFonts w:eastAsiaTheme="minorEastAsia"/>
-        </w:rPr>
-        <w:t>Although</w:t>
-      </w:r>
-      <w:r>
-        <w:rPr>
-          <w:rFonts w:eastAsiaTheme="minorEastAsia"/>
-        </w:rPr>
+        <w:t>&lt;</w:t>
+      </w:r>
+      <w:r>
         <w:t xml:space="preserve"> </w:t>
       </w:r>
       <w:r>
         <w:rPr>
-          <w:rFonts w:eastAsiaTheme="minorEastAsia"/>
-        </w:rPr>
-        <w:t xml:space="preserve">the initial </w:t>
-      </w:r>
-      <w:r>
-        <w:rPr>
-          <w:rFonts w:eastAsiaTheme="minorEastAsia"/>
-        </w:rPr>
-        <w:t xml:space="preserve">gradient </w:t>
-      </w:r>
-      <w:r>
-        <w:rPr>
-          <w:rFonts w:eastAsiaTheme="minorEastAsia"/>
-        </w:rPr>
-        <w:t xml:space="preserve">is smaller than in CO flow, the opposing movement of dialysate continually exposes the blood to fresher, lower-concentration dialysate, </w:t>
-      </w:r>
-      <w:r>
-        <w:rPr>
-          <w:rFonts w:eastAsiaTheme="minorEastAsia"/>
-        </w:rPr>
-        <w:t>thereby delaying equilibrium and producing a more gradual</w:t>
-      </w:r>
-      <w:r>
-        <w:rPr>
-          <w:rFonts w:eastAsiaTheme="minorEastAsia"/>
-        </w:rPr>
-        <w:t xml:space="preserve"> decline in </w:t>
-      </w:r>
-      <m:oMath>
-        <m:r>
-          <w:rPr>
-            <w:rFonts w:ascii="Cambria Math" w:hAnsi="Cambria Math"/>
-          </w:rPr>
-          <m:t>∆</m:t>
-        </m:r>
-        <m:d>
-          <m:dPr>
-            <m:ctrlPr>
-              <w:rPr>
-                <w:rFonts w:ascii="Cambria Math" w:hAnsi="Cambria Math"/>
-                <w:i/>
-              </w:rPr>
-            </m:ctrlPr>
-          </m:dPr>
-          <m:e>
-            <m:r>
-              <w:rPr>
-                <w:rFonts w:ascii="Cambria Math" w:hAnsi="Cambria Math"/>
-              </w:rPr>
-              <m:t>x</m:t>
-            </m:r>
-          </m:e>
-        </m:d>
-      </m:oMath>
-      <w:r>
-        <w:rPr>
-          <w:rFonts w:eastAsiaTheme="minorEastAsia"/>
-        </w:rPr>
-        <w:t xml:space="preserve">. </w:t>
-      </w:r>
-      <w:r>
-        <w:rPr>
-          <w:rFonts w:eastAsiaTheme="minorEastAsia"/>
-        </w:rPr>
-        <w:t>This sustained separation underlies the higher overall clearance achieved in CC operation.</w:t>
-      </w:r>
-      <w:r>
-        <w:rPr>
-          <w:rFonts w:eastAsiaTheme="minorEastAsia"/>
-        </w:rPr>
-        <w:t xml:space="preserve"> </w:t>
+          <w:rFonts w:eastAsiaTheme="minorHAnsi"/>
+        </w:rPr>
+        <w:t>Figure 6. Subject Level Population Dynamics (Simulated vs. ODE fit)</w:t>
+      </w:r>
+      <w:r>
+        <w:rPr>
+          <w:rFonts w:eastAsiaTheme="minorHAnsi"/>
+        </w:rPr>
+        <w:t>&gt;</w:t>
       </w:r>
     </w:p>
     <w:p>
@@ -1959,6 +1665,27 @@
           <w:rFonts w:eastAsiaTheme="minorHAnsi"/>
         </w:rPr>
       </w:pPr>
+      <w:r>
+        <w:rPr>
+          <w:rFonts w:eastAsiaTheme="minorHAnsi"/>
+        </w:rPr>
+        <w:t>&lt;</w:t>
+      </w:r>
+      <w:r>
+        <w:t xml:space="preserve"> </w:t>
+      </w:r>
+      <w:r>
+        <w:rPr>
+          <w:rFonts w:eastAsiaTheme="minorHAnsi"/>
+        </w:rPr>
+        <w:t>Table 2: Parameter Uncertainty (Standard Errors)</w:t>
+      </w:r>
+      <w:r>
+        <w:rPr>
+          <w:rFonts w:eastAsiaTheme="minorHAnsi"/>
+        </w:rPr>
+        <w:t>&gt;</w:t>
+      </w:r>
     </w:p>
     <w:p>
       <w:pPr>
@@ -1967,217 +1694,90 @@
         <w:contextualSpacing/>
         <w:jc w:val="both"/>
         <w:rPr>
-          <w:rFonts w:eastAsiaTheme="minorEastAsia"/>
-        </w:rPr>
-      </w:pPr>
-      <w:r>
-        <w:rPr>
-          <w:rFonts w:eastAsiaTheme="minorHAnsi"/>
-        </w:rPr>
-        <w:t xml:space="preserve">The corresponding individual concentration profiles </w:t>
-      </w:r>
-      <m:oMath>
-        <m:sSub>
-          <m:sSubPr>
-            <m:ctrlPr>
-              <w:rPr>
-                <w:rFonts w:ascii="Cambria Math" w:hAnsi="Cambria Math"/>
-                <w:i/>
-              </w:rPr>
-            </m:ctrlPr>
-          </m:sSubPr>
-          <m:e>
-            <m:r>
-              <w:rPr>
-                <w:rFonts w:ascii="Cambria Math" w:hAnsi="Cambria Math"/>
-              </w:rPr>
-              <m:t>C</m:t>
-            </m:r>
-          </m:e>
-          <m:sub>
-            <m:r>
-              <w:rPr>
-                <w:rFonts w:ascii="Cambria Math" w:hAnsi="Cambria Math"/>
-              </w:rPr>
-              <m:t>b</m:t>
-            </m:r>
-          </m:sub>
-        </m:sSub>
-        <m:d>
-          <m:dPr>
-            <m:ctrlPr>
-              <w:rPr>
-                <w:rFonts w:ascii="Cambria Math" w:hAnsi="Cambria Math"/>
-                <w:i/>
-              </w:rPr>
-            </m:ctrlPr>
-          </m:dPr>
-          <m:e>
-            <m:r>
-              <w:rPr>
-                <w:rFonts w:ascii="Cambria Math" w:hAnsi="Cambria Math"/>
-              </w:rPr>
-              <m:t>x</m:t>
-            </m:r>
-          </m:e>
-        </m:d>
-      </m:oMath>
-      <w:r>
-        <w:rPr>
-          <w:rFonts w:eastAsiaTheme="minorEastAsia"/>
-        </w:rPr>
+          <w:rFonts w:eastAsiaTheme="minorHAnsi"/>
+        </w:rPr>
+      </w:pPr>
+      <w:r>
+        <w:rPr>
+          <w:rFonts w:eastAsiaTheme="minorHAnsi"/>
+        </w:rPr>
+        <w:t>&lt;</w:t>
+      </w:r>
+      <w:r>
         <w:t xml:space="preserve"> </w:t>
       </w:r>
       <w:r>
         <w:rPr>
           <w:rFonts w:eastAsiaTheme="minorHAnsi"/>
         </w:rPr>
-        <w:t xml:space="preserve">and </w:t>
-      </w:r>
-      <m:oMath>
-        <m:sSub>
-          <m:sSubPr>
-            <m:ctrlPr>
-              <w:rPr>
-                <w:rFonts w:ascii="Cambria Math" w:hAnsi="Cambria Math"/>
-                <w:i/>
-              </w:rPr>
-            </m:ctrlPr>
-          </m:sSubPr>
-          <m:e>
-            <m:r>
-              <w:rPr>
-                <w:rFonts w:ascii="Cambria Math" w:hAnsi="Cambria Math"/>
-              </w:rPr>
-              <m:t>C</m:t>
-            </m:r>
-          </m:e>
-          <m:sub>
-            <m:r>
-              <w:rPr>
-                <w:rFonts w:ascii="Cambria Math" w:hAnsi="Cambria Math"/>
-              </w:rPr>
-              <m:t>d</m:t>
-            </m:r>
-          </m:sub>
-        </m:sSub>
-        <m:d>
-          <m:dPr>
-            <m:ctrlPr>
-              <w:rPr>
-                <w:rFonts w:ascii="Cambria Math" w:hAnsi="Cambria Math"/>
-                <w:i/>
-              </w:rPr>
-            </m:ctrlPr>
-          </m:dPr>
-          <m:e>
-            <m:r>
-              <w:rPr>
-                <w:rFonts w:ascii="Cambria Math" w:hAnsi="Cambria Math"/>
-              </w:rPr>
-              <m:t>x</m:t>
-            </m:r>
-          </m:e>
-        </m:d>
-      </m:oMath>
-      <w:r>
-        <w:rPr>
-          <w:rFonts w:eastAsiaTheme="minorEastAsia"/>
-        </w:rPr>
-        <w:t xml:space="preserve"> for the two configurations further reinforce the above interpretation (</w:t>
-      </w:r>
-      <w:r>
-        <w:rPr>
-          <w:rFonts w:eastAsiaTheme="minorEastAsia"/>
-          <w:b/>
-          <w:bCs/>
-        </w:rPr>
-        <w:t xml:space="preserve">Figure </w:t>
-      </w:r>
-      <w:r>
-        <w:rPr>
-          <w:rFonts w:eastAsiaTheme="minorEastAsia"/>
-          <w:b/>
-          <w:bCs/>
-        </w:rPr>
-        <w:t>2</w:t>
-      </w:r>
-      <w:r>
-        <w:rPr>
-          <w:rFonts w:eastAsiaTheme="minorEastAsia"/>
-          <w:b/>
-          <w:bCs/>
-        </w:rPr>
-        <w:t>b</w:t>
-      </w:r>
-      <w:r>
-        <w:rPr>
-          <w:rFonts w:eastAsiaTheme="minorEastAsia"/>
-        </w:rPr>
-        <w:t xml:space="preserve">). In CO flow, the blood concentration decreases sharply while the dialysate concentration rises quickly, causing the two curves to converge early and leaving much of the device operating  near equilibrium. In CC flow, however, the blood concentration declines while the dialysate concentration rises more gradually, and the two curves remain separated over a much larger portion of the fiber. This persistent gap mirrors the sustained profile and reflects the continuous renewal of the driving force for the solute transfer. Together, </w:t>
-      </w:r>
-      <w:r>
-        <w:rPr>
-          <w:rFonts w:eastAsiaTheme="minorEastAsia"/>
-          <w:b/>
-          <w:bCs/>
-          <w:i/>
-          <w:iCs/>
-        </w:rPr>
-        <w:t xml:space="preserve">Figures </w:t>
-      </w:r>
-      <w:r>
-        <w:rPr>
-          <w:rFonts w:eastAsiaTheme="minorEastAsia"/>
-          <w:b/>
-          <w:bCs/>
-          <w:i/>
-          <w:iCs/>
-        </w:rPr>
-        <w:t>2</w:t>
-      </w:r>
-      <w:r>
-        <w:rPr>
-          <w:rFonts w:eastAsiaTheme="minorEastAsia"/>
-          <w:b/>
-          <w:bCs/>
-          <w:i/>
-          <w:iCs/>
-        </w:rPr>
-        <w:t>(a)</w:t>
-      </w:r>
-      <w:r>
-        <w:rPr>
-          <w:rFonts w:eastAsiaTheme="minorEastAsia"/>
-        </w:rPr>
-        <w:t xml:space="preserve"> and </w:t>
-      </w:r>
-      <w:r>
-        <w:rPr>
-          <w:rFonts w:eastAsiaTheme="minorEastAsia"/>
-          <w:b/>
-          <w:bCs/>
-          <w:i/>
-          <w:iCs/>
-        </w:rPr>
-        <w:t>2</w:t>
-      </w:r>
-      <w:r>
-        <w:rPr>
-          <w:rFonts w:eastAsiaTheme="minorEastAsia"/>
-          <w:b/>
-          <w:bCs/>
-          <w:i/>
-          <w:iCs/>
-        </w:rPr>
-        <w:t>(b)</w:t>
-      </w:r>
-      <w:r>
-        <w:rPr>
-          <w:rFonts w:eastAsiaTheme="minorEastAsia"/>
-        </w:rPr>
-        <w:t xml:space="preserve"> demonstrate that CC flow distributes the driving force more effectively along the device, explaining its superior solute-removal performance over CO flow.</w:t>
-      </w:r>
+        <w:t>Figure 8. Residuals (Line Plots), Subject Level Population Dynamics</w:t>
+      </w:r>
+      <w:r>
+        <w:rPr>
+          <w:rFonts w:eastAsiaTheme="minorHAnsi"/>
+        </w:rPr>
+        <w:t>&gt;</w:t>
+      </w:r>
+    </w:p>
+    <w:p>
+      <w:pPr>
+        <w:pStyle w:val="NormalWeb"/>
+        <w:spacing w:before="0" w:beforeAutospacing="0" w:after="0" w:afterAutospacing="0"/>
+        <w:contextualSpacing/>
+        <w:jc w:val="both"/>
+        <w:rPr>
+          <w:rFonts w:eastAsiaTheme="minorHAnsi"/>
+        </w:rPr>
+      </w:pPr>
+      <w:r>
+        <w:rPr>
+          <w:rFonts w:eastAsiaTheme="minorHAnsi"/>
+        </w:rPr>
+        <w:t>&lt;</w:t>
+      </w:r>
+      <w:r>
+        <w:t xml:space="preserve"> </w:t>
+      </w:r>
+      <w:r>
+        <w:rPr>
+          <w:rFonts w:eastAsiaTheme="minorHAnsi"/>
+        </w:rPr>
+        <w:t>Figure 9. Residuals (Autocorrelation), Subject Level Population Dynamics</w:t>
+      </w:r>
+      <w:r>
+        <w:rPr>
+          <w:rFonts w:eastAsiaTheme="minorHAnsi"/>
+        </w:rPr>
+        <w:t>&gt;</w:t>
+      </w:r>
+    </w:p>
+    <w:p>
+      <w:pPr>
+        <w:pStyle w:val="NormalWeb"/>
+        <w:spacing w:before="0" w:beforeAutospacing="0" w:after="0" w:afterAutospacing="0"/>
+        <w:contextualSpacing/>
+        <w:jc w:val="both"/>
+        <w:rPr>
+          <w:rFonts w:eastAsiaTheme="minorHAnsi"/>
+        </w:rPr>
+      </w:pPr>
+      <w:r>
+        <w:rPr>
+          <w:rFonts w:eastAsiaTheme="minorHAnsi"/>
+        </w:rPr>
+        <w:t>&lt;&gt;</w:t>
+      </w:r>
+    </w:p>
+    <w:p>
+      <w:pPr>
+        <w:pStyle w:val="NormalWeb"/>
+        <w:spacing w:before="0" w:beforeAutospacing="0" w:after="0" w:afterAutospacing="0"/>
+        <w:contextualSpacing/>
+        <w:jc w:val="both"/>
+        <w:rPr>
+          <w:rFonts w:eastAsiaTheme="minorHAnsi"/>
+        </w:rPr>
+      </w:pPr>
     </w:p>
     <w:p>
       <w:pPr>
@@ -2194,14 +1794,6 @@
       <w:tblPr>
         <w:tblStyle w:val="TableGrid"/>
         <w:tblW w:w="0" w:type="auto"/>
-        <w:tblBorders>
-          <w:top w:val="none" w:sz="0" w:space="0" w:color="auto"/>
-          <w:left w:val="none" w:sz="0" w:space="0" w:color="auto"/>
-          <w:bottom w:val="none" w:sz="0" w:space="0" w:color="auto"/>
-          <w:right w:val="none" w:sz="0" w:space="0" w:color="auto"/>
-          <w:insideH w:val="none" w:sz="0" w:space="0" w:color="auto"/>
-          <w:insideV w:val="none" w:sz="0" w:space="0" w:color="auto"/>
-        </w:tblBorders>
         <w:tblCellMar>
           <w:left w:w="43" w:type="dxa"/>
           <w:right w:w="43" w:type="dxa"/>
@@ -2209,8 +1801,8 @@
         <w:tblLook w:val="04A0" w:firstRow="1" w:lastRow="0" w:firstColumn="1" w:lastColumn="0" w:noHBand="0" w:noVBand="1"/>
       </w:tblPr>
       <w:tblGrid>
-        <w:gridCol w:w="5034"/>
-        <w:gridCol w:w="5046"/>
+        <w:gridCol w:w="5035"/>
+        <w:gridCol w:w="5035"/>
       </w:tblGrid>
       <w:tr>
         <w:trPr>
@@ -2230,53 +1822,6 @@
                 <w:rFonts w:eastAsiaTheme="minorHAnsi"/>
               </w:rPr>
             </w:pPr>
-            <w:r>
-              <w:rPr>
-                <w:rFonts w:eastAsiaTheme="minorHAnsi"/>
-                <w:noProof/>
-              </w:rPr>
-              <w:drawing>
-                <wp:inline distT="0" distB="0" distL="0" distR="0" wp14:anchorId="5A6BB1A5" wp14:editId="0C17E213">
-                  <wp:extent cx="3218688" cy="2542032"/>
-                  <wp:effectExtent l="0" t="0" r="1270" b="0"/>
-                  <wp:docPr id="1163620022" name="Graphic 26"/>
-                  <wp:cNvGraphicFramePr>
-                    <a:graphicFrameLocks xmlns:a="http://schemas.openxmlformats.org/drawingml/2006/main" noChangeAspect="1"/>
-                  </wp:cNvGraphicFramePr>
-                  <a:graphic xmlns:a="http://schemas.openxmlformats.org/drawingml/2006/main">
-                    <a:graphicData uri="http://schemas.openxmlformats.org/drawingml/2006/picture">
-                      <pic:pic xmlns:pic="http://schemas.openxmlformats.org/drawingml/2006/picture">
-                        <pic:nvPicPr>
-                          <pic:cNvPr id="1163620022" name="Graphic 1163620022"/>
-                          <pic:cNvPicPr/>
-                        </pic:nvPicPr>
-                        <pic:blipFill>
-                          <a:blip r:embed="rId7">
-                            <a:extLst>
-                              <a:ext uri="{96DAC541-7B7A-43D3-8B79-37D633B846F1}">
-                                <asvg:svgBlip xmlns:asvg="http://schemas.microsoft.com/office/drawing/2016/SVG/main" r:embed="rId8"/>
-                              </a:ext>
-                            </a:extLst>
-                          </a:blip>
-                          <a:stretch>
-                            <a:fillRect/>
-                          </a:stretch>
-                        </pic:blipFill>
-                        <pic:spPr>
-                          <a:xfrm>
-                            <a:off x="0" y="0"/>
-                            <a:ext cx="3218688" cy="2542032"/>
-                          </a:xfrm>
-                          <a:prstGeom prst="rect">
-                            <a:avLst/>
-                          </a:prstGeom>
-                        </pic:spPr>
-                      </pic:pic>
-                    </a:graphicData>
-                  </a:graphic>
-                </wp:inline>
-              </w:drawing>
-            </w:r>
           </w:p>
         </w:tc>
         <w:tc>
@@ -2293,53 +1838,6 @@
                 <w:rFonts w:eastAsiaTheme="minorHAnsi"/>
               </w:rPr>
             </w:pPr>
-            <w:r>
-              <w:rPr>
-                <w:rFonts w:eastAsiaTheme="minorHAnsi"/>
-                <w:noProof/>
-              </w:rPr>
-              <w:drawing>
-                <wp:inline distT="0" distB="0" distL="0" distR="0" wp14:anchorId="33C0C5B1" wp14:editId="3709C002">
-                  <wp:extent cx="3227832" cy="2542032"/>
-                  <wp:effectExtent l="0" t="0" r="0" b="0"/>
-                  <wp:docPr id="654878116" name="Graphic 27"/>
-                  <wp:cNvGraphicFramePr>
-                    <a:graphicFrameLocks xmlns:a="http://schemas.openxmlformats.org/drawingml/2006/main" noChangeAspect="1"/>
-                  </wp:cNvGraphicFramePr>
-                  <a:graphic xmlns:a="http://schemas.openxmlformats.org/drawingml/2006/main">
-                    <a:graphicData uri="http://schemas.openxmlformats.org/drawingml/2006/picture">
-                      <pic:pic xmlns:pic="http://schemas.openxmlformats.org/drawingml/2006/picture">
-                        <pic:nvPicPr>
-                          <pic:cNvPr id="654878116" name="Graphic 654878116"/>
-                          <pic:cNvPicPr/>
-                        </pic:nvPicPr>
-                        <pic:blipFill>
-                          <a:blip r:embed="rId9">
-                            <a:extLst>
-                              <a:ext uri="{96DAC541-7B7A-43D3-8B79-37D633B846F1}">
-                                <asvg:svgBlip xmlns:asvg="http://schemas.microsoft.com/office/drawing/2016/SVG/main" r:embed="rId10"/>
-                              </a:ext>
-                            </a:extLst>
-                          </a:blip>
-                          <a:stretch>
-                            <a:fillRect/>
-                          </a:stretch>
-                        </pic:blipFill>
-                        <pic:spPr>
-                          <a:xfrm>
-                            <a:off x="0" y="0"/>
-                            <a:ext cx="3227832" cy="2542032"/>
-                          </a:xfrm>
-                          <a:prstGeom prst="rect">
-                            <a:avLst/>
-                          </a:prstGeom>
-                        </pic:spPr>
-                      </pic:pic>
-                    </a:graphicData>
-                  </a:graphic>
-                </wp:inline>
-              </w:drawing>
-            </w:r>
           </w:p>
         </w:tc>
       </w:tr>
@@ -2366,7 +1864,6 @@
                 <w:i/>
                 <w:iCs/>
               </w:rPr>
-              <w:lastRenderedPageBreak/>
               <w:t xml:space="preserve">Figure </w:t>
             </w:r>
             <w:r>
@@ -2377,7 +1874,7 @@
                 <w:i/>
                 <w:iCs/>
               </w:rPr>
-              <w:t>2</w:t>
+              <w:t>xx</w:t>
             </w:r>
             <w:r>
               <w:rPr>
@@ -2394,30 +1891,6 @@
                 <w:rFonts w:eastAsiaTheme="minorHAnsi"/>
               </w:rPr>
               <w:t xml:space="preserve"> </w:t>
-            </w:r>
-            <w:r>
-              <w:rPr>
-                <w:rFonts w:eastAsiaTheme="minorHAnsi"/>
-              </w:rPr>
-              <w:t>Box model predicted spatial concentration gradient</w:t>
-            </w:r>
-            <w:r>
-              <w:rPr>
-                <w:rFonts w:eastAsiaTheme="minorHAnsi"/>
-              </w:rPr>
-              <w:t>s</w:t>
-            </w:r>
-            <w:r>
-              <w:rPr>
-                <w:rFonts w:eastAsiaTheme="minorHAnsi"/>
-              </w:rPr>
-              <w:t xml:space="preserve"> (a) and concentration</w:t>
-            </w:r>
-            <w:r>
-              <w:rPr>
-                <w:rFonts w:eastAsiaTheme="minorHAnsi"/>
-              </w:rPr>
-              <w:t>s during co-current and counter-current kidney dialysis.</w:t>
             </w:r>
           </w:p>
         </w:tc>
@@ -3133,10 +2606,10 @@
                           <pic:cNvPicPr/>
                         </pic:nvPicPr>
                         <pic:blipFill>
-                          <a:blip r:embed="rId11">
+                          <a:blip r:embed="rId7">
                             <a:extLst>
                               <a:ext uri="{96DAC541-7B7A-43D3-8B79-37D633B846F1}">
-                                <asvg:svgBlip xmlns:asvg="http://schemas.microsoft.com/office/drawing/2016/SVG/main" r:embed="rId12"/>
+                                <asvg:svgBlip xmlns:asvg="http://schemas.microsoft.com/office/drawing/2016/SVG/main" r:embed="rId8"/>
                               </a:ext>
                             </a:extLst>
                           </a:blip>
@@ -3196,10 +2669,10 @@
                           <pic:cNvPicPr/>
                         </pic:nvPicPr>
                         <pic:blipFill>
-                          <a:blip r:embed="rId13">
+                          <a:blip r:embed="rId9">
                             <a:extLst>
                               <a:ext uri="{96DAC541-7B7A-43D3-8B79-37D633B846F1}">
-                                <asvg:svgBlip xmlns:asvg="http://schemas.microsoft.com/office/drawing/2016/SVG/main" r:embed="rId14"/>
+                                <asvg:svgBlip xmlns:asvg="http://schemas.microsoft.com/office/drawing/2016/SVG/main" r:embed="rId10"/>
                               </a:ext>
                             </a:extLst>
                           </a:blip>
@@ -3249,7 +2722,6 @@
                 <w:rFonts w:eastAsiaTheme="minorHAnsi"/>
                 <w:noProof/>
               </w:rPr>
-              <w:lastRenderedPageBreak/>
               <w:drawing>
                 <wp:inline distT="0" distB="0" distL="0" distR="0" wp14:anchorId="21923D97" wp14:editId="1F9A3C50">
                   <wp:extent cx="3227832" cy="2569464"/>
@@ -3266,10 +2738,10 @@
                           <pic:cNvPicPr/>
                         </pic:nvPicPr>
                         <pic:blipFill>
-                          <a:blip r:embed="rId15">
+                          <a:blip r:embed="rId11">
                             <a:extLst>
                               <a:ext uri="{96DAC541-7B7A-43D3-8B79-37D633B846F1}">
-                                <asvg:svgBlip xmlns:asvg="http://schemas.microsoft.com/office/drawing/2016/SVG/main" r:embed="rId16"/>
+                                <asvg:svgBlip xmlns:asvg="http://schemas.microsoft.com/office/drawing/2016/SVG/main" r:embed="rId12"/>
                               </a:ext>
                             </a:extLst>
                           </a:blip>
@@ -3517,6 +2989,7 @@
         <w:rPr>
           <w:rFonts w:eastAsiaTheme="minorEastAsia"/>
         </w:rPr>
+        <w:lastRenderedPageBreak/>
         <w:t xml:space="preserve">The </w:t>
       </w:r>
       <w:r>
@@ -4030,7 +3503,6 @@
                 <w:rFonts w:eastAsiaTheme="minorHAnsi"/>
                 <w:noProof/>
               </w:rPr>
-              <w:lastRenderedPageBreak/>
               <w:drawing>
                 <wp:inline distT="0" distB="0" distL="0" distR="0" wp14:anchorId="41A9E0FB" wp14:editId="0EA8B95A">
                   <wp:extent cx="3227832" cy="2569464"/>
@@ -4047,10 +3519,10 @@
                           <pic:cNvPicPr/>
                         </pic:nvPicPr>
                         <pic:blipFill>
-                          <a:blip r:embed="rId17">
+                          <a:blip r:embed="rId13">
                             <a:extLst>
                               <a:ext uri="{96DAC541-7B7A-43D3-8B79-37D633B846F1}">
-                                <asvg:svgBlip xmlns:asvg="http://schemas.microsoft.com/office/drawing/2016/SVG/main" r:embed="rId18"/>
+                                <asvg:svgBlip xmlns:asvg="http://schemas.microsoft.com/office/drawing/2016/SVG/main" r:embed="rId14"/>
                               </a:ext>
                             </a:extLst>
                           </a:blip>
@@ -4110,10 +3582,10 @@
                           <pic:cNvPicPr/>
                         </pic:nvPicPr>
                         <pic:blipFill>
-                          <a:blip r:embed="rId19">
+                          <a:blip r:embed="rId15">
                             <a:extLst>
                               <a:ext uri="{96DAC541-7B7A-43D3-8B79-37D633B846F1}">
-                                <asvg:svgBlip xmlns:asvg="http://schemas.microsoft.com/office/drawing/2016/SVG/main" r:embed="rId20"/>
+                                <asvg:svgBlip xmlns:asvg="http://schemas.microsoft.com/office/drawing/2016/SVG/main" r:embed="rId16"/>
                               </a:ext>
                             </a:extLst>
                           </a:blip>
@@ -4176,10 +3648,10 @@
                           <pic:cNvPicPr/>
                         </pic:nvPicPr>
                         <pic:blipFill>
-                          <a:blip r:embed="rId21">
+                          <a:blip r:embed="rId17">
                             <a:extLst>
                               <a:ext uri="{96DAC541-7B7A-43D3-8B79-37D633B846F1}">
-                                <asvg:svgBlip xmlns:asvg="http://schemas.microsoft.com/office/drawing/2016/SVG/main" r:embed="rId22"/>
+                                <asvg:svgBlip xmlns:asvg="http://schemas.microsoft.com/office/drawing/2016/SVG/main" r:embed="rId18"/>
                               </a:ext>
                             </a:extLst>
                           </a:blip>
@@ -4228,6 +3700,7 @@
                 <w:i/>
                 <w:iCs/>
               </w:rPr>
+              <w:lastRenderedPageBreak/>
               <w:t xml:space="preserve">Figure </w:t>
             </w:r>
             <w:r>
@@ -4895,10 +4368,10 @@
                           <pic:cNvPicPr/>
                         </pic:nvPicPr>
                         <pic:blipFill>
-                          <a:blip r:embed="rId23">
+                          <a:blip r:embed="rId19">
                             <a:extLst>
                               <a:ext uri="{96DAC541-7B7A-43D3-8B79-37D633B846F1}">
-                                <asvg:svgBlip xmlns:asvg="http://schemas.microsoft.com/office/drawing/2016/SVG/main" r:embed="rId24"/>
+                                <asvg:svgBlip xmlns:asvg="http://schemas.microsoft.com/office/drawing/2016/SVG/main" r:embed="rId20"/>
                               </a:ext>
                             </a:extLst>
                           </a:blip>
@@ -5227,6 +4700,7 @@
         <w:rPr>
           <w:rFonts w:eastAsiaTheme="minorEastAsia"/>
         </w:rPr>
+        <w:lastRenderedPageBreak/>
         <w:t>The experimental results</w:t>
       </w:r>
       <w:r>
@@ -5656,7 +5130,6 @@
         <w:rPr>
           <w:rFonts w:eastAsiaTheme="minorHAnsi"/>
         </w:rPr>
-        <w:lastRenderedPageBreak/>
         <w:t>The combined spatial-temporal analysis reveals a coherent mechanistic pi</w:t>
       </w:r>
       <w:r>
@@ -9139,7 +8612,7 @@
       </w:r>
     </w:p>
     <w:sectPr>
-      <w:footerReference w:type="default" r:id="rId25"/>
+      <w:footerReference w:type="default" r:id="rId21"/>
       <w:pgSz w:w="12240" w:h="15840"/>
       <w:pgMar w:top="1440" w:right="1080" w:bottom="1440" w:left="1080" w:header="720" w:footer="720" w:gutter="0"/>
       <w:cols w:space="720"/>

</xml_diff>

<commit_message>
Update notebooks and figures (excluding report)
</commit_message>
<xml_diff>
--- a/report/asfaw_paudel_hair_follicle_modeling.docx
+++ b/report/asfaw_paudel_hair_follicle_modeling.docx
@@ -292,21 +292,7 @@
         <w:rPr>
           <w:rFonts w:eastAsiaTheme="minorHAnsi"/>
         </w:rPr>
-        <w:t xml:space="preserve">Hair follicles undergo a cyclic process consisting of three primary phases: anagen (growth phase), catagen (transition phase), and telogen (resting phase). Transitions between these phases are regulated by complex interactions of biochemical signals, including proteins such as </w:t>
-      </w:r>
-      <w:proofErr w:type="spellStart"/>
-      <w:r>
-        <w:rPr>
-          <w:rFonts w:eastAsiaTheme="minorHAnsi"/>
-        </w:rPr>
-        <w:t>Wnt</w:t>
-      </w:r>
-      <w:proofErr w:type="spellEnd"/>
-      <w:r>
-        <w:rPr>
-          <w:rFonts w:eastAsiaTheme="minorHAnsi"/>
-        </w:rPr>
-        <w:t xml:space="preserve"> and various hormones. Over the years, several studies have proposed mathematical models—particularly systems of ordinary differential equations (ODEs)—to capture these dynamics. For example, Al-Nuaimi et al. (2012) introduced a compartment-based model demonstrating oscillatory switching between growth and resting states, while Wang et al. (2017) developed a multi-scale framework to model spatial propagation of follicle activation. More recently, Alzubadi (2024) incorporated immune system interactions to better explain pathological conditions such as alopecia.</w:t>
+        <w:t>Hair follicles undergo a cyclic process consisting of three primary phases: anagen (growth phase), catagen (transition phase), and telogen (resting phase). Transitions between these phases are regulated by complex interactions of biochemical signals, including proteins such as Wnt and various hormones. Over the years, several studies have proposed mathematical models—particularly systems of ordinary differential equations (ODEs)—to capture these dynamics. For example, Al-Nuaimi et al. (2012) introduced a compartment-based model demonstrating oscillatory switching between growth and resting states, while Wang et al. (2017) developed a multi-scale framework to model spatial propagation of follicle activation. More recently, Alzubadi (2024) incorporated immune system interactions to better explain pathological conditions such as alopecia.</w:t>
       </w:r>
     </w:p>
     <w:p>
@@ -786,21 +772,7 @@
               <w:rPr>
                 <w:bCs/>
               </w:rPr>
-              <w:t xml:space="preserve">Catagen to </w:t>
-            </w:r>
-            <w:proofErr w:type="spellStart"/>
-            <w:r>
-              <w:rPr>
-                <w:bCs/>
-              </w:rPr>
-              <w:t>Telogent</w:t>
-            </w:r>
-            <w:proofErr w:type="spellEnd"/>
-            <w:r>
-              <w:rPr>
-                <w:bCs/>
-              </w:rPr>
-              <w:t xml:space="preserve"> transit rate</w:t>
+              <w:t>Catagen to Telogent transit rate</w:t>
             </w:r>
           </w:p>
         </w:tc>
@@ -1127,19 +1099,11 @@
                 <w:bCs/>
               </w:rPr>
             </w:pPr>
-            <w:proofErr w:type="spellStart"/>
             <w:r>
               <w:rPr>
                 <w:bCs/>
               </w:rPr>
-              <w:t>Wnt</w:t>
-            </w:r>
-            <w:proofErr w:type="spellEnd"/>
-            <w:r>
-              <w:rPr>
-                <w:bCs/>
-              </w:rPr>
-              <w:t>/FGF5</w:t>
+              <w:t>Wnt/FGF5</w:t>
             </w:r>
             <w:r>
               <w:rPr>
@@ -1801,8 +1765,7 @@
         <w:tblLook w:val="04A0" w:firstRow="1" w:lastRow="0" w:firstColumn="1" w:lastColumn="0" w:noHBand="0" w:noVBand="1"/>
       </w:tblPr>
       <w:tblGrid>
-        <w:gridCol w:w="5035"/>
-        <w:gridCol w:w="5035"/>
+        <w:gridCol w:w="10070"/>
       </w:tblGrid>
       <w:tr>
         <w:trPr>
@@ -1810,7 +1773,7 @@
         </w:trPr>
         <w:tc>
           <w:tcPr>
-            <w:tcW w:w="5035" w:type="dxa"/>
+            <w:tcW w:w="10070" w:type="dxa"/>
           </w:tcPr>
           <w:p>
             <w:pPr>
@@ -1822,22 +1785,59 @@
                 <w:rFonts w:eastAsiaTheme="minorHAnsi"/>
               </w:rPr>
             </w:pPr>
-          </w:p>
-        </w:tc>
-        <w:tc>
-          <w:tcPr>
-            <w:tcW w:w="5035" w:type="dxa"/>
-          </w:tcPr>
-          <w:p>
-            <w:pPr>
-              <w:pStyle w:val="NormalWeb"/>
-              <w:spacing w:before="0" w:beforeAutospacing="0" w:after="0" w:afterAutospacing="0"/>
-              <w:contextualSpacing/>
-              <w:jc w:val="both"/>
-              <w:rPr>
-                <w:rFonts w:eastAsiaTheme="minorHAnsi"/>
-              </w:rPr>
-            </w:pPr>
+            <w:r>
+              <w:rPr>
+                <w:noProof/>
+              </w:rPr>
+              <w:drawing>
+                <wp:inline distT="0" distB="0" distL="0" distR="0" wp14:anchorId="13CE19DE" wp14:editId="010714D2">
+                  <wp:extent cx="6400800" cy="4093845"/>
+                  <wp:effectExtent l="0" t="0" r="0" b="1905"/>
+                  <wp:docPr id="368633110" name="Picture 1"/>
+                  <wp:cNvGraphicFramePr>
+                    <a:graphicFrameLocks xmlns:a="http://schemas.openxmlformats.org/drawingml/2006/main" noChangeAspect="1"/>
+                  </wp:cNvGraphicFramePr>
+                  <a:graphic xmlns:a="http://schemas.openxmlformats.org/drawingml/2006/main">
+                    <a:graphicData uri="http://schemas.openxmlformats.org/drawingml/2006/picture">
+                      <pic:pic xmlns:pic="http://schemas.openxmlformats.org/drawingml/2006/picture">
+                        <pic:nvPicPr>
+                          <pic:cNvPr id="0" name="Picture 1"/>
+                          <pic:cNvPicPr>
+                            <a:picLocks noChangeAspect="1" noChangeArrowheads="1"/>
+                          </pic:cNvPicPr>
+                        </pic:nvPicPr>
+                        <pic:blipFill>
+                          <a:blip r:embed="rId7">
+                            <a:extLst>
+                              <a:ext uri="{28A0092B-C50C-407E-A947-70E740481C1C}">
+                                <a14:useLocalDpi xmlns:a14="http://schemas.microsoft.com/office/drawing/2010/main" val="0"/>
+                              </a:ext>
+                            </a:extLst>
+                          </a:blip>
+                          <a:srcRect/>
+                          <a:stretch>
+                            <a:fillRect/>
+                          </a:stretch>
+                        </pic:blipFill>
+                        <pic:spPr bwMode="auto">
+                          <a:xfrm>
+                            <a:off x="0" y="0"/>
+                            <a:ext cx="6400800" cy="4093845"/>
+                          </a:xfrm>
+                          <a:prstGeom prst="rect">
+                            <a:avLst/>
+                          </a:prstGeom>
+                          <a:noFill/>
+                          <a:ln>
+                            <a:noFill/>
+                          </a:ln>
+                        </pic:spPr>
+                      </pic:pic>
+                    </a:graphicData>
+                  </a:graphic>
+                </wp:inline>
+              </w:drawing>
+            </w:r>
           </w:p>
         </w:tc>
       </w:tr>
@@ -1845,7 +1845,6 @@
         <w:tc>
           <w:tcPr>
             <w:tcW w:w="10070" w:type="dxa"/>
-            <w:gridSpan w:val="2"/>
           </w:tcPr>
           <w:p>
             <w:pPr>
@@ -2049,7 +2048,14 @@
         <w:rPr>
           <w:rFonts w:eastAsiaTheme="minorEastAsia"/>
         </w:rPr>
-        <w:t xml:space="preserve"> flow when K</w:t>
+        <w:t xml:space="preserve"> flow </w:t>
+      </w:r>
+      <w:r>
+        <w:rPr>
+          <w:rFonts w:eastAsiaTheme="minorEastAsia"/>
+        </w:rPr>
+        <w:lastRenderedPageBreak/>
+        <w:t>when K</w:t>
       </w:r>
       <w:r>
         <w:rPr>
@@ -2606,10 +2612,10 @@
                           <pic:cNvPicPr/>
                         </pic:nvPicPr>
                         <pic:blipFill>
-                          <a:blip r:embed="rId7">
+                          <a:blip r:embed="rId8">
                             <a:extLst>
                               <a:ext uri="{96DAC541-7B7A-43D3-8B79-37D633B846F1}">
-                                <asvg:svgBlip xmlns:asvg="http://schemas.microsoft.com/office/drawing/2016/SVG/main" r:embed="rId8"/>
+                                <asvg:svgBlip xmlns:asvg="http://schemas.microsoft.com/office/drawing/2016/SVG/main" r:embed="rId9"/>
                               </a:ext>
                             </a:extLst>
                           </a:blip>
@@ -2669,10 +2675,10 @@
                           <pic:cNvPicPr/>
                         </pic:nvPicPr>
                         <pic:blipFill>
-                          <a:blip r:embed="rId9">
+                          <a:blip r:embed="rId10">
                             <a:extLst>
                               <a:ext uri="{96DAC541-7B7A-43D3-8B79-37D633B846F1}">
-                                <asvg:svgBlip xmlns:asvg="http://schemas.microsoft.com/office/drawing/2016/SVG/main" r:embed="rId10"/>
+                                <asvg:svgBlip xmlns:asvg="http://schemas.microsoft.com/office/drawing/2016/SVG/main" r:embed="rId11"/>
                               </a:ext>
                             </a:extLst>
                           </a:blip>
@@ -2722,6 +2728,7 @@
                 <w:rFonts w:eastAsiaTheme="minorHAnsi"/>
                 <w:noProof/>
               </w:rPr>
+              <w:lastRenderedPageBreak/>
               <w:drawing>
                 <wp:inline distT="0" distB="0" distL="0" distR="0" wp14:anchorId="21923D97" wp14:editId="1F9A3C50">
                   <wp:extent cx="3227832" cy="2569464"/>
@@ -2738,10 +2745,10 @@
                           <pic:cNvPicPr/>
                         </pic:nvPicPr>
                         <pic:blipFill>
-                          <a:blip r:embed="rId11">
+                          <a:blip r:embed="rId12">
                             <a:extLst>
                               <a:ext uri="{96DAC541-7B7A-43D3-8B79-37D633B846F1}">
-                                <asvg:svgBlip xmlns:asvg="http://schemas.microsoft.com/office/drawing/2016/SVG/main" r:embed="rId12"/>
+                                <asvg:svgBlip xmlns:asvg="http://schemas.microsoft.com/office/drawing/2016/SVG/main" r:embed="rId13"/>
                               </a:ext>
                             </a:extLst>
                           </a:blip>
@@ -2989,7 +2996,6 @@
         <w:rPr>
           <w:rFonts w:eastAsiaTheme="minorEastAsia"/>
         </w:rPr>
-        <w:lastRenderedPageBreak/>
         <w:t xml:space="preserve">The </w:t>
       </w:r>
       <w:r>
@@ -3503,6 +3509,7 @@
                 <w:rFonts w:eastAsiaTheme="minorHAnsi"/>
                 <w:noProof/>
               </w:rPr>
+              <w:lastRenderedPageBreak/>
               <w:drawing>
                 <wp:inline distT="0" distB="0" distL="0" distR="0" wp14:anchorId="41A9E0FB" wp14:editId="0EA8B95A">
                   <wp:extent cx="3227832" cy="2569464"/>
@@ -3519,10 +3526,10 @@
                           <pic:cNvPicPr/>
                         </pic:nvPicPr>
                         <pic:blipFill>
-                          <a:blip r:embed="rId13">
+                          <a:blip r:embed="rId14">
                             <a:extLst>
                               <a:ext uri="{96DAC541-7B7A-43D3-8B79-37D633B846F1}">
-                                <asvg:svgBlip xmlns:asvg="http://schemas.microsoft.com/office/drawing/2016/SVG/main" r:embed="rId14"/>
+                                <asvg:svgBlip xmlns:asvg="http://schemas.microsoft.com/office/drawing/2016/SVG/main" r:embed="rId15"/>
                               </a:ext>
                             </a:extLst>
                           </a:blip>
@@ -3582,10 +3589,10 @@
                           <pic:cNvPicPr/>
                         </pic:nvPicPr>
                         <pic:blipFill>
-                          <a:blip r:embed="rId15">
+                          <a:blip r:embed="rId16">
                             <a:extLst>
                               <a:ext uri="{96DAC541-7B7A-43D3-8B79-37D633B846F1}">
-                                <asvg:svgBlip xmlns:asvg="http://schemas.microsoft.com/office/drawing/2016/SVG/main" r:embed="rId16"/>
+                                <asvg:svgBlip xmlns:asvg="http://schemas.microsoft.com/office/drawing/2016/SVG/main" r:embed="rId17"/>
                               </a:ext>
                             </a:extLst>
                           </a:blip>
@@ -3648,10 +3655,10 @@
                           <pic:cNvPicPr/>
                         </pic:nvPicPr>
                         <pic:blipFill>
-                          <a:blip r:embed="rId17">
+                          <a:blip r:embed="rId18">
                             <a:extLst>
                               <a:ext uri="{96DAC541-7B7A-43D3-8B79-37D633B846F1}">
-                                <asvg:svgBlip xmlns:asvg="http://schemas.microsoft.com/office/drawing/2016/SVG/main" r:embed="rId18"/>
+                                <asvg:svgBlip xmlns:asvg="http://schemas.microsoft.com/office/drawing/2016/SVG/main" r:embed="rId19"/>
                               </a:ext>
                             </a:extLst>
                           </a:blip>
@@ -3700,7 +3707,6 @@
                 <w:i/>
                 <w:iCs/>
               </w:rPr>
-              <w:lastRenderedPageBreak/>
               <w:t xml:space="preserve">Figure </w:t>
             </w:r>
             <w:r>
@@ -4368,10 +4374,10 @@
                           <pic:cNvPicPr/>
                         </pic:nvPicPr>
                         <pic:blipFill>
-                          <a:blip r:embed="rId19">
+                          <a:blip r:embed="rId20">
                             <a:extLst>
                               <a:ext uri="{96DAC541-7B7A-43D3-8B79-37D633B846F1}">
-                                <asvg:svgBlip xmlns:asvg="http://schemas.microsoft.com/office/drawing/2016/SVG/main" r:embed="rId20"/>
+                                <asvg:svgBlip xmlns:asvg="http://schemas.microsoft.com/office/drawing/2016/SVG/main" r:embed="rId21"/>
                               </a:ext>
                             </a:extLst>
                           </a:blip>
@@ -4700,7 +4706,6 @@
         <w:rPr>
           <w:rFonts w:eastAsiaTheme="minorEastAsia"/>
         </w:rPr>
-        <w:lastRenderedPageBreak/>
         <w:t>The experimental results</w:t>
       </w:r>
       <w:r>
@@ -5130,6 +5135,7 @@
         <w:rPr>
           <w:rFonts w:eastAsiaTheme="minorHAnsi"/>
         </w:rPr>
+        <w:lastRenderedPageBreak/>
         <w:t>The combined spatial-temporal analysis reveals a coherent mechanistic pi</w:t>
       </w:r>
       <w:r>
@@ -8612,7 +8618,7 @@
       </w:r>
     </w:p>
     <w:sectPr>
-      <w:footerReference w:type="default" r:id="rId21"/>
+      <w:footerReference w:type="default" r:id="rId22"/>
       <w:pgSz w:w="12240" w:h="15840"/>
       <w:pgMar w:top="1440" w:right="1080" w:bottom="1440" w:left="1080" w:header="720" w:footer="720" w:gutter="0"/>
       <w:cols w:space="720"/>

</xml_diff>